<commit_message>
Release v1.2.0 — rename plugin id to paraqualis-gxp
- plugin.json / marketplace.json: plugin id paraqualis-skills -> paraqualis-gxp (broader GxP/CSV scope than Part 11)
- Install is now: /plugin install paraqualis-gxp@paraqualis (repo + 'paraqualis' marketplace unchanged)
- server_version() reads name+version from plugin.json (single source of truth)
- Updated install commands in README/OVERVIEW/PUBLISHING/CHANGELOG; bumped self-qualification pack to v1.2.0

Co-Authored-By: Claude Opus 4.8 (1M context) <noreply@anthropic.com>
</commit_message>
<xml_diff>
--- a/Qualification/docs/Gap-Analysis.docx
+++ b/Qualification/docs/Gap-Analysis.docx
@@ -13,7 +13,7 @@
           <w:color w:val="276BB2"/>
           <w:sz w:val="36"/>
         </w:rPr>
-        <w:t>Gap Analysis — paraqualis-skills v1.1.0</w:t>
+        <w:t>Gap Analysis — paraqualis-skills v1.2.0</w:t>
       </w:r>
     </w:p>
     <w:p>
@@ -1469,7 +1469,7 @@
               <w:rPr>
                 <w:sz w:val="18"/>
               </w:rPr>
-              <w:t xml:space="preserve"> The version (`1.1.0`) lives only in a static file; no running component reports it. In a regulated setting you must be able to confirm at any time that the version in use is the qualified one.</w:t>
+              <w:t xml:space="preserve"> The version (`1.2.0`) lives only in a static file; no running component reports it. In a regulated setting you must be able to confirm at any time that the version in use is the qualified one.</w:t>
             </w:r>
           </w:p>
         </w:tc>
@@ -1574,7 +1574,7 @@
               <w:rPr>
                 <w:sz w:val="18"/>
               </w:rPr>
-              <w:t xml:space="preserve"> — `server_version()` MCP tool added; returns `plugin.json` version + Python runtime (verified 1.1.0 / 3.12.13).</w:t>
+              <w:t xml:space="preserve"> — `server_version()` MCP tool added; returns `plugin.json` version + Python runtime (verified 1.2.0 / 3.12.13).</w:t>
             </w:r>
           </w:p>
         </w:tc>
@@ -2957,7 +2957,65 @@
               <w:rPr>
                 <w:sz w:val="18"/>
               </w:rPr>
-              <w:t>Qualified-version references updated to v1.1.0 (release bump; remediated build).</w:t>
+              <w:t>Qualified-version references updated to v1.2.0 (release bump; remediated build).</w:t>
+            </w:r>
+          </w:p>
+        </w:tc>
+      </w:tr>
+      <w:tr>
+        <w:tc>
+          <w:tcPr>
+            <w:tcW w:type="dxa" w:w="3528"/>
+          </w:tcPr>
+          <w:p>
+            <w:r/>
+            <w:r>
+              <w:rPr>
+                <w:sz w:val="18"/>
+              </w:rPr>
+              <w:t>0.7 (DRAFT)</w:t>
+            </w:r>
+          </w:p>
+        </w:tc>
+        <w:tc>
+          <w:tcPr>
+            <w:tcW w:type="dxa" w:w="3528"/>
+          </w:tcPr>
+          <w:p>
+            <w:r/>
+            <w:r>
+              <w:rPr>
+                <w:sz w:val="18"/>
+              </w:rPr>
+              <w:t>2026-06-18</w:t>
+            </w:r>
+          </w:p>
+        </w:tc>
+        <w:tc>
+          <w:tcPr>
+            <w:tcW w:type="dxa" w:w="3528"/>
+          </w:tcPr>
+          <w:p>
+            <w:r/>
+            <w:r>
+              <w:rPr>
+                <w:sz w:val="18"/>
+              </w:rPr>
+              <w:t>ParaQualis qualification engine</w:t>
+            </w:r>
+          </w:p>
+        </w:tc>
+        <w:tc>
+          <w:tcPr>
+            <w:tcW w:type="dxa" w:w="3528"/>
+          </w:tcPr>
+          <w:p>
+            <w:r/>
+            <w:r>
+              <w:rPr>
+                <w:sz w:val="18"/>
+              </w:rPr>
+              <w:t>Plugin id renamed paraqualis-skills → paraqualis-gxp; version 1.1.0 → 1.2.0 (no functional change).</w:t>
             </w:r>
           </w:p>
         </w:tc>

</xml_diff>